<commit_message>
M2 : fiche de documentation individuelle de Khadija Ben Ayed
Journal complété : 9 échanges avec Claude Code (intégration M2,
API Open-Meteo réelle, back-office, frontend, revue de sécurité,
captures des tests), justification du LSTM et gains de productivité.

Co-Authored-By: Claude Opus 5.5 <noreply@anthropic.com>
</commit_message>
<xml_diff>
--- a/docs/documentation-individuelle/Documentation-individuelle-Khadija-Ben-Ayed.docx
+++ b/docs/documentation-individuelle/Documentation-individuelle-Khadija-Ben-Ayed.docx
@@ -352,6 +352,166 @@
           </w:p>
         </w:tc>
       </w:tr>
+      <w:tr>
+        <w:tc>
+          <w:tcPr>
+            <w:tcW w:type="dxa" w:w="2880"/>
+          </w:tcPr>
+          <w:p>
+            <w:r>
+              <w:t>« vérifier le projet run ou non, c’est correct ? »</w:t>
+            </w:r>
+          </w:p>
+        </w:tc>
+        <w:tc>
+          <w:tcPr>
+            <w:tcW w:type="dxa" w:w="2880"/>
+          </w:tcPr>
+          <w:p>
+            <w:r>
+              <w:t>Lancement des 9 conteneurs et des tests backend et IA un par un dans Docker</w:t>
+            </w:r>
+          </w:p>
+        </w:tc>
+        <w:tc>
+          <w:tcPr>
+            <w:tcW w:type="dxa" w:w="2880"/>
+          </w:tcPr>
+          <w:p>
+            <w:r>
+              <w:t>Journaux Docker relus ; échecs d’installation (réseau lent) corrigés par des réessais</w:t>
+            </w:r>
+          </w:p>
+        </w:tc>
+      </w:tr>
+      <w:tr>
+        <w:tc>
+          <w:tcPr>
+            <w:tcW w:type="dxa" w:w="2880"/>
+          </w:tcPr>
+          <w:p>
+            <w:r>
+              <w:t>« je veux éliminer swagger complètement … un projet réel pas de mock »</w:t>
+            </w:r>
+          </w:p>
+        </w:tc>
+        <w:tc>
+          <w:tcPr>
+            <w:tcW w:type="dxa" w:w="2880"/>
+          </w:tcPr>
+          <w:p>
+            <w:r>
+              <w:t>Suppression de springdoc, page d’état du backend, entraînement réel de M1 et M6</w:t>
+            </w:r>
+          </w:p>
+        </w:tc>
+        <w:tc>
+          <w:tcPr>
+            <w:tcW w:type="dxa" w:w="2880"/>
+          </w:tcPr>
+          <w:p>
+            <w:r>
+              <w:t>Page /api/status : 6 « Modèle réel »</w:t>
+            </w:r>
+          </w:p>
+        </w:tc>
+      </w:tr>
+      <w:tr>
+        <w:tc>
+          <w:tcPr>
+            <w:tcW w:type="dxa" w:w="2880"/>
+          </w:tcPr>
+          <w:p>
+            <w:r>
+              <w:t>« change le frontend, je veux un travail organisé … et de même le backend »</w:t>
+            </w:r>
+          </w:p>
+        </w:tc>
+        <w:tc>
+          <w:tcPr>
+            <w:tcW w:type="dxa" w:w="2880"/>
+          </w:tcPr>
+          <w:p>
+            <w:r>
+              <w:t>Refonte de l’interface (barre latérale, palette olive et or), écran d’irrigation M2 sur 7 ou 14 jours</w:t>
+            </w:r>
+          </w:p>
+        </w:tc>
+        <w:tc>
+          <w:tcPr>
+            <w:tcW w:type="dxa" w:w="2880"/>
+          </w:tcPr>
+          <w:p>
+            <w:r>
+              <w:t>15 tests Angular, contrôle visuel de chaque page</w:t>
+            </w:r>
+          </w:p>
+        </w:tc>
+      </w:tr>
+      <w:tr>
+        <w:tc>
+          <w:tcPr>
+            <w:tcW w:type="dxa" w:w="2880"/>
+          </w:tcPr>
+          <w:p>
+            <w:r>
+              <w:t>« compare avec la grille d’évaluation »</w:t>
+            </w:r>
+          </w:p>
+        </w:tc>
+        <w:tc>
+          <w:tcPr>
+            <w:tcW w:type="dxa" w:w="2880"/>
+          </w:tcPr>
+          <w:p>
+            <w:r>
+              <w:t>Revue de sécurité (Bandit, npm audit), correction de 2 alertes, chapitre IA générative</w:t>
+            </w:r>
+          </w:p>
+        </w:tc>
+        <w:tc>
+          <w:tcPr>
+            <w:tcW w:type="dxa" w:w="2880"/>
+          </w:tcPr>
+          <w:p>
+            <w:r>
+              <w:t>Tests M1 et M2 relancés après correction, Bandit sans alerte</w:t>
+            </w:r>
+          </w:p>
+        </w:tc>
+      </w:tr>
+      <w:tr>
+        <w:tc>
+          <w:tcPr>
+            <w:tcW w:type="dxa" w:w="2880"/>
+          </w:tcPr>
+          <w:p>
+            <w:r>
+              <w:t>« je veux faire les captures des tests moi-même, donne les commandes »</w:t>
+            </w:r>
+          </w:p>
+        </w:tc>
+        <w:tc>
+          <w:tcPr>
+            <w:tcW w:type="dxa" w:w="2880"/>
+          </w:tcPr>
+          <w:p>
+            <w:r>
+              <w:t>Commandes PowerShell pour chaque série de tests</w:t>
+            </w:r>
+          </w:p>
+        </w:tc>
+        <w:tc>
+          <w:tcPr>
+            <w:tcW w:type="dxa" w:w="2880"/>
+          </w:tcPr>
+          <w:p>
+            <w:r>
+              <w:t>Captures prises par moi : 154 tests réussis</w:t>
+            </w:r>
+          </w:p>
+        </w:tc>
+      </w:tr>
     </w:tbl>
     <w:p>
       <w:r>

</xml_diff>